<commit_message>
kết thúc demo svm và knn nhận dạng số
</commit_message>
<xml_diff>
--- a/number.docx
+++ b/number.docx
@@ -14,161 +14,240 @@
           <w:sz w:val="100"/>
           <w:szCs w:val="100"/>
         </w:rPr>
+        <w:t>0 1 2</w:t>
+      </w:r>
+      <w:r>
+        <w:rPr>
+          <w:sz w:val="100"/>
+          <w:szCs w:val="100"/>
+        </w:rPr>
+        <w:t xml:space="preserve"> 3 4 5 6 7 8 9</w:t>
+      </w:r>
+    </w:p>
+    <w:p>
+      <w:pPr>
+        <w:rPr>
+          <w:rFonts w:asciiTheme="majorHAnsi" w:hAnsiTheme="majorHAnsi" w:cstheme="majorHAnsi"/>
+          <w:sz w:val="100"/>
+          <w:szCs w:val="100"/>
+        </w:rPr>
+      </w:pPr>
+      <w:r>
+        <w:rPr>
+          <w:rFonts w:asciiTheme="majorHAnsi" w:hAnsiTheme="majorHAnsi" w:cstheme="majorHAnsi"/>
+          <w:sz w:val="100"/>
+          <w:szCs w:val="100"/>
+        </w:rPr>
+        <w:t>0 1 2</w:t>
+      </w:r>
+      <w:r>
+        <w:rPr>
+          <w:rFonts w:asciiTheme="majorHAnsi" w:hAnsiTheme="majorHAnsi" w:cstheme="majorHAnsi"/>
+          <w:sz w:val="100"/>
+          <w:szCs w:val="100"/>
+        </w:rPr>
+        <w:t xml:space="preserve"> 3 4 5 6 7 8 9</w:t>
+      </w:r>
+    </w:p>
+    <w:p>
+      <w:pPr>
+        <w:rPr>
+          <w:rFonts w:ascii="Arial" w:hAnsi="Arial" w:cs="Arial"/>
+          <w:sz w:val="100"/>
+          <w:szCs w:val="100"/>
+        </w:rPr>
+      </w:pPr>
+      <w:r>
+        <w:rPr>
+          <w:rFonts w:ascii="Arial" w:hAnsi="Arial" w:cs="Arial"/>
+          <w:sz w:val="100"/>
+          <w:szCs w:val="100"/>
+        </w:rPr>
+        <w:t>0 1 2</w:t>
+      </w:r>
+      <w:r>
+        <w:rPr>
+          <w:rFonts w:ascii="Arial" w:hAnsi="Arial" w:cs="Arial"/>
+          <w:sz w:val="100"/>
+          <w:szCs w:val="100"/>
+        </w:rPr>
+        <w:t xml:space="preserve"> 3 4 5 6 7 8 9</w:t>
+      </w:r>
+    </w:p>
+    <w:p>
+      <w:pPr>
+        <w:rPr>
+          <w:rFonts w:ascii="Times New Roman" w:hAnsi="Times New Roman" w:cs="Times New Roman"/>
+          <w:sz w:val="100"/>
+          <w:szCs w:val="100"/>
+        </w:rPr>
+      </w:pPr>
+      <w:r>
+        <w:rPr>
+          <w:rFonts w:ascii="Times New Roman" w:hAnsi="Times New Roman" w:cs="Times New Roman"/>
+          <w:sz w:val="100"/>
+          <w:szCs w:val="100"/>
+        </w:rPr>
+        <w:t>0 1 2</w:t>
+      </w:r>
+      <w:r>
+        <w:rPr>
+          <w:rFonts w:ascii="Times New Roman" w:hAnsi="Times New Roman" w:cs="Times New Roman"/>
+          <w:sz w:val="100"/>
+          <w:szCs w:val="100"/>
+        </w:rPr>
+        <w:t xml:space="preserve"> 3 4 5 6 7 8 9</w:t>
+      </w:r>
+    </w:p>
+    <w:p>
+      <w:pPr>
+        <w:rPr>
+          <w:rFonts w:ascii=".VnArabia" w:hAnsi=".VnArabia"/>
+          <w:sz w:val="100"/>
+          <w:szCs w:val="100"/>
+        </w:rPr>
+      </w:pPr>
+      <w:r>
+        <w:rPr>
+          <w:rFonts w:ascii=".VnArabia" w:hAnsi=".VnArabia"/>
+          <w:sz w:val="100"/>
+          <w:szCs w:val="100"/>
+        </w:rPr>
+        <w:t>0 1 2</w:t>
+      </w:r>
+      <w:r>
+        <w:rPr>
+          <w:rFonts w:ascii=".VnArabia" w:hAnsi=".VnArabia"/>
+          <w:sz w:val="100"/>
+          <w:szCs w:val="100"/>
+        </w:rPr>
+        <w:t xml:space="preserve"> 3 4 5 6 7 8 9 0</w:t>
+      </w:r>
+    </w:p>
+    <w:p>
+      <w:pPr>
+        <w:rPr>
+          <w:rFonts w:ascii=".VnArial" w:hAnsi=".VnArial"/>
+          <w:sz w:val="100"/>
+          <w:szCs w:val="100"/>
+        </w:rPr>
+      </w:pPr>
+      <w:r>
+        <w:rPr>
+          <w:rFonts w:ascii=".VnArial" w:hAnsi=".VnArial"/>
+          <w:sz w:val="100"/>
+          <w:szCs w:val="100"/>
+        </w:rPr>
+        <w:t>0     1     2</w:t>
+      </w:r>
+      <w:r>
+        <w:rPr>
+          <w:rFonts w:ascii=".VnArial" w:hAnsi=".VnArial"/>
+          <w:sz w:val="100"/>
+          <w:szCs w:val="100"/>
+        </w:rPr>
+        <w:t>345678890</w:t>
+      </w:r>
+    </w:p>
+    <w:p>
+      <w:pPr>
+        <w:rPr>
+          <w:rFonts w:ascii=".VnArial NarrowH" w:hAnsi=".VnArial NarrowH"/>
+          <w:sz w:val="100"/>
+          <w:szCs w:val="100"/>
+        </w:rPr>
+      </w:pPr>
+      <w:r>
+        <w:rPr>
+          <w:rFonts w:ascii=".VnArial NarrowH" w:hAnsi=".VnArial NarrowH"/>
+          <w:sz w:val="100"/>
+          <w:szCs w:val="100"/>
+        </w:rPr>
         <w:t>0      1      2</w:t>
       </w:r>
-    </w:p>
-    <w:p>
-      <w:pPr>
-        <w:rPr>
-          <w:rFonts w:asciiTheme="majorHAnsi" w:hAnsiTheme="majorHAnsi" w:cstheme="majorHAnsi"/>
-          <w:sz w:val="100"/>
-          <w:szCs w:val="100"/>
-        </w:rPr>
-      </w:pPr>
-      <w:r>
-        <w:rPr>
-          <w:rFonts w:asciiTheme="majorHAnsi" w:hAnsiTheme="majorHAnsi" w:cstheme="majorHAnsi"/>
-          <w:sz w:val="100"/>
-          <w:szCs w:val="100"/>
-        </w:rPr>
-        <w:t>0      1      2</w:t>
-      </w:r>
-    </w:p>
-    <w:p>
-      <w:pPr>
-        <w:rPr>
-          <w:rFonts w:ascii="Arial" w:hAnsi="Arial" w:cs="Arial"/>
-          <w:sz w:val="100"/>
-          <w:szCs w:val="100"/>
-        </w:rPr>
-      </w:pPr>
-      <w:r>
-        <w:rPr>
-          <w:rFonts w:ascii="Arial" w:hAnsi="Arial" w:cs="Arial"/>
-          <w:sz w:val="100"/>
-          <w:szCs w:val="100"/>
-        </w:rPr>
+      <w:r>
+        <w:rPr>
+          <w:rFonts w:ascii=".VnArial NarrowH" w:hAnsi=".VnArial NarrowH"/>
+          <w:sz w:val="100"/>
+          <w:szCs w:val="100"/>
+        </w:rPr>
+        <w:t>3</w:t>
+      </w:r>
+    </w:p>
+    <w:p>
+      <w:pPr>
+        <w:rPr>
+          <w:rFonts w:ascii=".VnArial" w:hAnsi=".VnArial"/>
+          <w:sz w:val="100"/>
+          <w:szCs w:val="100"/>
+        </w:rPr>
+      </w:pPr>
+      <w:r>
+        <w:rPr>
+          <w:rFonts w:ascii=".VnArial" w:hAnsi=".VnArial"/>
+          <w:sz w:val="100"/>
+          <w:szCs w:val="100"/>
+        </w:rPr>
+        <w:lastRenderedPageBreak/>
         <w:t>0     1     2</w:t>
       </w:r>
-    </w:p>
-    <w:p>
-      <w:pPr>
-        <w:rPr>
-          <w:rFonts w:ascii="Times New Roman" w:hAnsi="Times New Roman" w:cs="Times New Roman"/>
-          <w:sz w:val="100"/>
-          <w:szCs w:val="100"/>
-        </w:rPr>
-      </w:pPr>
-      <w:r>
-        <w:rPr>
-          <w:rFonts w:ascii="Times New Roman" w:hAnsi="Times New Roman" w:cs="Times New Roman"/>
-          <w:sz w:val="100"/>
-          <w:szCs w:val="100"/>
-        </w:rPr>
-        <w:t>0      1      2</w:t>
-      </w:r>
-    </w:p>
-    <w:p>
-      <w:pPr>
-        <w:rPr>
-          <w:rFonts w:ascii=".VnArabia" w:hAnsi=".VnArabia"/>
-          <w:sz w:val="100"/>
-          <w:szCs w:val="100"/>
-        </w:rPr>
-      </w:pPr>
-      <w:r>
-        <w:rPr>
-          <w:rFonts w:ascii=".VnArabia" w:hAnsi=".VnArabia"/>
+      <w:r>
+        <w:rPr>
+          <w:rFonts w:ascii=".VnArial" w:hAnsi=".VnArial"/>
+          <w:sz w:val="100"/>
+          <w:szCs w:val="100"/>
+        </w:rPr>
+        <w:t>3</w:t>
+      </w:r>
+    </w:p>
+    <w:p>
+      <w:pPr>
+        <w:rPr>
+          <w:rFonts w:ascii=".VnBlack" w:hAnsi=".VnBlack"/>
+          <w:sz w:val="100"/>
+          <w:szCs w:val="100"/>
+        </w:rPr>
+      </w:pPr>
+      <w:r>
+        <w:rPr>
+          <w:rFonts w:ascii=".VnBlack" w:hAnsi=".VnBlack"/>
+          <w:sz w:val="100"/>
+          <w:szCs w:val="100"/>
+        </w:rPr>
+        <w:t>0   1   2</w:t>
+      </w:r>
+      <w:r>
+        <w:rPr>
+          <w:rFonts w:ascii=".VnBlack" w:hAnsi=".VnBlack"/>
+          <w:sz w:val="100"/>
+          <w:szCs w:val="100"/>
+        </w:rPr>
+        <w:t>3</w:t>
+      </w:r>
+    </w:p>
+    <w:p>
+      <w:pPr>
+        <w:rPr>
+          <w:rFonts w:ascii=".VnCentury SchoolbookH" w:hAnsi=".VnCentury SchoolbookH"/>
+          <w:sz w:val="100"/>
+          <w:szCs w:val="100"/>
+        </w:rPr>
+      </w:pPr>
+      <w:r>
+        <w:rPr>
+          <w:rFonts w:ascii=".VnCentury SchoolbookH" w:hAnsi=".VnCentury SchoolbookH"/>
           <w:sz w:val="100"/>
           <w:szCs w:val="100"/>
         </w:rPr>
         <w:t>0     1     2</w:t>
       </w:r>
-    </w:p>
-    <w:p>
-      <w:pPr>
-        <w:rPr>
-          <w:rFonts w:ascii=".VnArial" w:hAnsi=".VnArial"/>
-          <w:sz w:val="100"/>
-          <w:szCs w:val="100"/>
-        </w:rPr>
-      </w:pPr>
-      <w:r>
-        <w:rPr>
-          <w:rFonts w:ascii=".VnArial" w:hAnsi=".VnArial"/>
-          <w:sz w:val="100"/>
-          <w:szCs w:val="100"/>
-        </w:rPr>
-        <w:t>0     1     2</w:t>
-      </w:r>
-    </w:p>
-    <w:p>
-      <w:pPr>
-        <w:rPr>
-          <w:rFonts w:ascii=".VnArial NarrowH" w:hAnsi=".VnArial NarrowH"/>
-          <w:sz w:val="100"/>
-          <w:szCs w:val="100"/>
-        </w:rPr>
-      </w:pPr>
-      <w:r>
-        <w:rPr>
-          <w:rFonts w:ascii=".VnArial NarrowH" w:hAnsi=".VnArial NarrowH"/>
-          <w:sz w:val="100"/>
-          <w:szCs w:val="100"/>
-        </w:rPr>
-        <w:t>0      1      2</w:t>
-      </w:r>
-    </w:p>
-    <w:p>
-      <w:pPr>
-        <w:rPr>
-          <w:rFonts w:ascii=".VnArial" w:hAnsi=".VnArial"/>
-          <w:sz w:val="100"/>
-          <w:szCs w:val="100"/>
-        </w:rPr>
-      </w:pPr>
-      <w:r>
-        <w:rPr>
-          <w:rFonts w:ascii=".VnArial" w:hAnsi=".VnArial"/>
-          <w:sz w:val="100"/>
-          <w:szCs w:val="100"/>
-        </w:rPr>
-        <w:t>0     1     2</w:t>
-      </w:r>
-    </w:p>
-    <w:p>
-      <w:pPr>
-        <w:rPr>
-          <w:rFonts w:ascii=".VnBlack" w:hAnsi=".VnBlack"/>
-          <w:sz w:val="100"/>
-          <w:szCs w:val="100"/>
-        </w:rPr>
-      </w:pPr>
-      <w:r>
-        <w:rPr>
-          <w:rFonts w:ascii=".VnBlack" w:hAnsi=".VnBlack"/>
-          <w:sz w:val="100"/>
-          <w:szCs w:val="100"/>
-        </w:rPr>
-        <w:lastRenderedPageBreak/>
-        <w:t>0   1   2</w:t>
-      </w:r>
-    </w:p>
-    <w:p>
-      <w:pPr>
+      <w:r>
         <w:rPr>
           <w:rFonts w:ascii=".VnCentury SchoolbookH" w:hAnsi=".VnCentury SchoolbookH"/>
           <w:sz w:val="100"/>
           <w:szCs w:val="100"/>
         </w:rPr>
-      </w:pPr>
-      <w:r>
-        <w:rPr>
-          <w:rFonts w:ascii=".VnCentury SchoolbookH" w:hAnsi=".VnCentury SchoolbookH"/>
-          <w:sz w:val="100"/>
-          <w:szCs w:val="100"/>
-        </w:rPr>
-        <w:t>0     1     2</w:t>
+        <w:t>3</w:t>
       </w:r>
     </w:p>
     <w:p>
@@ -211,6 +290,16 @@
         </w:rPr>
         <w:t xml:space="preserve">  2</w:t>
       </w:r>
+      <w:r>
+        <w:rPr>
+          <w:rFonts w:ascii=".VnCourier" w:hAnsi=".VnCourier"/>
+          <w:b/>
+          <w:bCs/>
+          <w:sz w:val="100"/>
+          <w:szCs w:val="100"/>
+        </w:rPr>
+        <w:t>3</w:t>
+      </w:r>
     </w:p>
     <w:p>
       <w:pPr>
@@ -228,6 +317,14 @@
         </w:rPr>
         <w:t>0     1     2</w:t>
       </w:r>
+      <w:r>
+        <w:rPr>
+          <w:rFonts w:ascii=".VnHelvetInsH" w:hAnsi=".VnHelvetInsH"/>
+          <w:sz w:val="100"/>
+          <w:szCs w:val="100"/>
+        </w:rPr>
+        <w:t>3</w:t>
+      </w:r>
     </w:p>
     <w:p>
       <w:pPr>
@@ -244,6 +341,14 @@
           <w:szCs w:val="100"/>
         </w:rPr>
         <w:t>0  1  2</w:t>
+      </w:r>
+      <w:r>
+        <w:rPr>
+          <w:rFonts w:ascii=".VnCourier NewH" w:hAnsi=".VnCourier NewH"/>
+          <w:sz w:val="100"/>
+          <w:szCs w:val="100"/>
+        </w:rPr>
+        <w:t>3</w:t>
       </w:r>
     </w:p>
     <w:p>
@@ -298,6 +403,7 @@
           <w:sz w:val="100"/>
           <w:szCs w:val="100"/>
         </w:rPr>
+        <w:lastRenderedPageBreak/>
         <w:t>0      1      2</w:t>
       </w:r>
     </w:p>
@@ -315,7 +421,6 @@
           <w:sz w:val="100"/>
           <w:szCs w:val="100"/>
         </w:rPr>
-        <w:lastRenderedPageBreak/>
         <w:t>0    1    2</w:t>
       </w:r>
     </w:p>
@@ -439,6 +544,7 @@
           <w:sz w:val="100"/>
           <w:szCs w:val="100"/>
         </w:rPr>
+        <w:lastRenderedPageBreak/>
         <w:t>0    1    2</w:t>
       </w:r>
     </w:p>
@@ -456,7 +562,6 @@
           <w:sz w:val="100"/>
           <w:szCs w:val="100"/>
         </w:rPr>
-        <w:lastRenderedPageBreak/>
         <w:t>0    1    2</w:t>
       </w:r>
     </w:p>

</xml_diff>